<commit_message>
fix: fix Japanese font rendering in figures (Noto Sans JP) and regenerate paper.docx
</commit_message>
<xml_diff>
--- a/docs/paper.docx
+++ b/docs/paper.docx
@@ -503,7 +503,7 @@
       <w:r>
         <w:drawing>
           <wp:inline xmlns:a="http://schemas.openxmlformats.org/drawingml/2006/main" xmlns:pic="http://schemas.openxmlformats.org/drawingml/2006/picture">
-            <wp:extent cx="5029200" cy="1673568"/>
+            <wp:extent cx="5029200" cy="1670736"/>
             <wp:docPr id="2" name="Picture 2"/>
             <wp:cNvGraphicFramePr>
               <a:graphicFrameLocks noChangeAspect="1"/>
@@ -524,7 +524,7 @@
                   <pic:spPr>
                     <a:xfrm>
                       <a:off x="0" y="0"/>
-                      <a:ext cx="5029200" cy="1673568"/>
+                      <a:ext cx="5029200" cy="1670736"/>
                     </a:xfrm>
                     <a:prstGeom prst="rect"/>
                   </pic:spPr>
@@ -1713,7 +1713,7 @@
       <w:r>
         <w:drawing>
           <wp:inline xmlns:a="http://schemas.openxmlformats.org/drawingml/2006/main" xmlns:pic="http://schemas.openxmlformats.org/drawingml/2006/picture">
-            <wp:extent cx="5029200" cy="1339995"/>
+            <wp:extent cx="5029200" cy="1346741"/>
             <wp:docPr id="6" name="Picture 6"/>
             <wp:cNvGraphicFramePr>
               <a:graphicFrameLocks noChangeAspect="1"/>
@@ -1734,7 +1734,7 @@
                   <pic:spPr>
                     <a:xfrm>
                       <a:off x="0" y="0"/>
-                      <a:ext cx="5029200" cy="1339995"/>
+                      <a:ext cx="5029200" cy="1346741"/>
                     </a:xfrm>
                     <a:prstGeom prst="rect"/>
                   </pic:spPr>

</xml_diff>